<commit_message>
Update technical qualification report
</commit_message>
<xml_diff>
--- a/docs/reports/teknik_yeterlilik_raporu.docx
+++ b/docs/reports/teknik_yeterlilik_raporu.docx
@@ -4928,7 +4928,7 @@
                 <w:szCs w:val="24"/>
                 <w:lang w:eastAsia="tr-TR" w:bidi="tr-TR"/>
               </w:rPr>
-              <w:t>Motor</w:t>
+              <w:t>Kaldırma Motoru</w:t>
             </w:r>
           </w:p>
         </w:tc>
@@ -4951,6 +4951,9 @@
                 <w:lang w:eastAsia="tr-TR" w:bidi="tr-TR"/>
               </w:rPr>
             </w:pPr>
+            <w:r>
+              <w:t>Volt Motor</w:t>
+            </w:r>
           </w:p>
         </w:tc>
         <w:tc>
@@ -4972,6 +4975,9 @@
                 <w:lang w:eastAsia="tr-TR" w:bidi="tr-TR"/>
               </w:rPr>
             </w:pPr>
+            <w:r>
+              <w:t>VMD-24-RED</w:t>
+            </w:r>
           </w:p>
         </w:tc>
         <w:tc>
@@ -4993,6 +4999,9 @@
                 <w:lang w:eastAsia="tr-TR" w:bidi="tr-TR"/>
               </w:rPr>
             </w:pPr>
+            <w:r>
+              <w:t>24V DC redüktörlü, dikey eksen yüksek torklu tahrik motoru.</w:t>
+            </w:r>
           </w:p>
         </w:tc>
         <w:tc>
@@ -5014,6 +5023,9 @@
                 <w:lang w:eastAsia="tr-TR" w:bidi="tr-TR"/>
               </w:rPr>
             </w:pPr>
+            <w:r>
+              <w:t>4.500,00 TL</w:t>
+            </w:r>
           </w:p>
         </w:tc>
       </w:tr>
@@ -5045,7 +5057,7 @@
                 <w:szCs w:val="24"/>
                 <w:lang w:eastAsia="tr-TR" w:bidi="tr-TR"/>
               </w:rPr>
-              <w:t>Araç Gövdesi</w:t>
+              <w:t>Bilyalı Vida Mili</w:t>
             </w:r>
           </w:p>
         </w:tc>
@@ -5065,6 +5077,9 @@
                 <w:lang w:eastAsia="tr-TR" w:bidi="tr-TR"/>
               </w:rPr>
             </w:pPr>
+            <w:r>
+              <w:t>BİVATEK</w:t>
+            </w:r>
           </w:p>
         </w:tc>
         <w:tc>
@@ -5083,6 +5098,9 @@
                 <w:lang w:eastAsia="tr-TR" w:bidi="tr-TR"/>
               </w:rPr>
             </w:pPr>
+            <w:r>
+              <w:t>SFU1605 Serisi</w:t>
+            </w:r>
           </w:p>
         </w:tc>
         <w:tc>
@@ -5101,6 +5119,9 @@
                 <w:lang w:eastAsia="tr-TR" w:bidi="tr-TR"/>
               </w:rPr>
             </w:pPr>
+            <w:r>
+              <w:t>Hatve: 5 mm, çap: 16 mm, 0-300 mm strok uyumlu hassas vidalı mil.</w:t>
+            </w:r>
           </w:p>
         </w:tc>
         <w:tc>
@@ -5119,6 +5140,9 @@
                 <w:lang w:eastAsia="tr-TR" w:bidi="tr-TR"/>
               </w:rPr>
             </w:pPr>
+            <w:r>
+              <w:t>3.200,00 TL</w:t>
+            </w:r>
           </w:p>
         </w:tc>
       </w:tr>
@@ -5153,7 +5177,7 @@
                 <w:szCs w:val="24"/>
                 <w:lang w:eastAsia="tr-TR" w:bidi="tr-TR"/>
               </w:rPr>
-              <w:t>Mekanik Aksamlar Mil</w:t>
+              <w:t>Lineer Kılavuz Ray</w:t>
             </w:r>
           </w:p>
         </w:tc>
@@ -5173,6 +5197,9 @@
                 <w:lang w:eastAsia="tr-TR" w:bidi="tr-TR"/>
               </w:rPr>
             </w:pPr>
+            <w:r>
+              <w:t>ENDO Lineer</w:t>
+            </w:r>
           </w:p>
         </w:tc>
         <w:tc>
@@ -5191,6 +5218,9 @@
                 <w:lang w:eastAsia="tr-TR" w:bidi="tr-TR"/>
               </w:rPr>
             </w:pPr>
+            <w:r>
+              <w:t>SBC HGR15</w:t>
+            </w:r>
           </w:p>
         </w:tc>
         <w:tc>
@@ -5209,6 +5239,9 @@
                 <w:lang w:eastAsia="tr-TR" w:bidi="tr-TR"/>
               </w:rPr>
             </w:pPr>
+            <w:r>
+              <w:t>Çatal taşıyıcının dikey eksende rijit ve salınımsız hareket etmesini sağlayan 2 adet çelik ray.</w:t>
+            </w:r>
           </w:p>
         </w:tc>
         <w:tc>
@@ -5227,6 +5260,9 @@
                 <w:lang w:eastAsia="tr-TR" w:bidi="tr-TR"/>
               </w:rPr>
             </w:pPr>
+            <w:r>
+              <w:t>2.900,00 TL</w:t>
+            </w:r>
           </w:p>
         </w:tc>
       </w:tr>
@@ -5261,7 +5297,7 @@
                 <w:szCs w:val="24"/>
                 <w:lang w:eastAsia="tr-TR" w:bidi="tr-TR"/>
               </w:rPr>
-              <w:t>Yataklı Rulman</w:t>
+              <w:t>Kızak Blokları</w:t>
             </w:r>
           </w:p>
         </w:tc>
@@ -5283,6 +5319,9 @@
                 <w:lang w:eastAsia="tr-TR" w:bidi="tr-TR"/>
               </w:rPr>
             </w:pPr>
+            <w:r>
+              <w:t>ENDO Lineer</w:t>
+            </w:r>
           </w:p>
         </w:tc>
         <w:tc>
@@ -5303,6 +5342,9 @@
                 <w:lang w:eastAsia="tr-TR" w:bidi="tr-TR"/>
               </w:rPr>
             </w:pPr>
+            <w:r>
+              <w:t>HGH15CA</w:t>
+            </w:r>
           </w:p>
         </w:tc>
         <w:tc>
@@ -5323,6 +5365,9 @@
                 <w:lang w:eastAsia="tr-TR" w:bidi="tr-TR"/>
               </w:rPr>
             </w:pPr>
+            <w:r>
+              <w:t>Lineer raylar üzerinde yük taşıyan yüksek moment kapasiteli 4 adet bilyalı araba blok.</w:t>
+            </w:r>
           </w:p>
         </w:tc>
         <w:tc>
@@ -5342,6 +5387,517 @@
                 <w:lang w:eastAsia="tr-TR" w:bidi="tr-TR"/>
               </w:rPr>
             </w:pPr>
+            <w:r>
+              <w:t>1.850,00 TL</w:t>
+            </w:r>
+          </w:p>
+        </w:tc>
+      </w:tr>
+      <w:tr>
+        <w:trPr>
+          <w:trHeight w:val="148"/>
+        </w:trPr>
+        <w:tc>
+          <w:tcPr>
+            <w:tcW w:w="1990" w:type="dxa"/>
+            <w:vAlign w:val="center"/>
+          </w:tcPr>
+          <w:p>
+            <w:pPr>
+              <w:spacing w:line="276" w:lineRule="auto"/>
+              <w:jc w:val="center"/>
+              <w:rPr>
+                <w:rFonts w:ascii="Trebuchet MS" w:hAnsi="Trebuchet MS" w:cs="Arial"/>
+                <w:b/>
+                <w:bCs/>
+                <w:sz w:val="24"/>
+                <w:szCs w:val="24"/>
+                <w:lang w:eastAsia="tr-TR" w:bidi="tr-TR"/>
+              </w:rPr>
+            </w:pPr>
+            <w:r>
+              <w:rPr>
+                <w:rFonts w:ascii="Trebuchet MS" w:hAnsi="Trebuchet MS" w:cs="Arial"/>
+                <w:b/>
+                <w:bCs/>
+                <w:sz w:val="24"/>
+                <w:szCs w:val="24"/>
+                <w:lang w:eastAsia="tr-TR" w:bidi="tr-TR"/>
+              </w:rPr>
+              <w:t>Çatal Taşıyıcı Ünite</w:t>
+            </w:r>
+          </w:p>
+        </w:tc>
+        <w:tc>
+          <w:tcPr>
+            <w:tcW w:w="1166" w:type="dxa"/>
+          </w:tcPr>
+          <w:p>
+            <w:pPr>
+              <w:spacing w:line="276" w:lineRule="auto"/>
+              <w:ind w:firstLine="459"/>
+              <w:jc w:val="both"/>
+              <w:rPr>
+                <w:rFonts w:ascii="Trebuchet MS" w:hAnsi="Trebuchet MS" w:cs="Arial"/>
+                <w:b/>
+                <w:i/>
+                <w:sz w:val="24"/>
+                <w:szCs w:val="24"/>
+                <w:lang w:eastAsia="tr-TR" w:bidi="tr-TR"/>
+              </w:rPr>
+            </w:pPr>
+            <w:r>
+              <w:t>Takım tasarımı</w:t>
+            </w:r>
+          </w:p>
+        </w:tc>
+        <w:tc>
+          <w:tcPr>
+            <w:tcW w:w="1267" w:type="dxa"/>
+          </w:tcPr>
+          <w:p>
+            <w:pPr>
+              <w:spacing w:line="276" w:lineRule="auto"/>
+              <w:ind w:firstLine="459"/>
+              <w:jc w:val="both"/>
+              <w:rPr>
+                <w:rFonts w:ascii="Trebuchet MS" w:hAnsi="Trebuchet MS" w:cs="Arial"/>
+                <w:b/>
+                <w:i/>
+                <w:sz w:val="24"/>
+                <w:szCs w:val="24"/>
+                <w:lang w:eastAsia="tr-TR" w:bidi="tr-TR"/>
+              </w:rPr>
+            </w:pPr>
+            <w:r>
+              <w:t>Custom Fork-01</w:t>
+            </w:r>
+          </w:p>
+        </w:tc>
+        <w:tc>
+          <w:tcPr>
+            <w:tcW w:w="3632" w:type="dxa"/>
+          </w:tcPr>
+          <w:p>
+            <w:pPr>
+              <w:spacing w:line="276" w:lineRule="auto"/>
+              <w:ind w:firstLine="459"/>
+              <w:jc w:val="both"/>
+              <w:rPr>
+                <w:rFonts w:ascii="Trebuchet MS" w:hAnsi="Trebuchet MS" w:cs="Arial"/>
+                <w:b/>
+                <w:i/>
+                <w:sz w:val="24"/>
+                <w:szCs w:val="24"/>
+                <w:lang w:eastAsia="tr-TR" w:bidi="tr-TR"/>
+              </w:rPr>
+            </w:pPr>
+            <w:r>
+              <w:t>220-420 mm arası genişliği ayarlanabilir, minimum 80 mm çatal yüksekliğine sahip çelik üst yapı aksesuarı.</w:t>
+            </w:r>
+          </w:p>
+        </w:tc>
+        <w:tc>
+          <w:tcPr>
+            <w:tcW w:w="967" w:type="dxa"/>
+          </w:tcPr>
+          <w:p>
+            <w:pPr>
+              <w:spacing w:line="276" w:lineRule="auto"/>
+              <w:ind w:firstLine="459"/>
+              <w:jc w:val="both"/>
+              <w:rPr>
+                <w:rFonts w:ascii="Trebuchet MS" w:hAnsi="Trebuchet MS" w:cs="Arial"/>
+                <w:b/>
+                <w:sz w:val="24"/>
+                <w:szCs w:val="24"/>
+                <w:lang w:eastAsia="tr-TR" w:bidi="tr-TR"/>
+              </w:rPr>
+            </w:pPr>
+            <w:r>
+              <w:t>5.500,00 TL</w:t>
+            </w:r>
+          </w:p>
+        </w:tc>
+      </w:tr>
+      <w:tr>
+        <w:trPr>
+          <w:trHeight w:val="148"/>
+        </w:trPr>
+        <w:tc>
+          <w:tcPr>
+            <w:tcW w:w="1990" w:type="dxa"/>
+            <w:vAlign w:val="center"/>
+          </w:tcPr>
+          <w:p>
+            <w:pPr>
+              <w:spacing w:line="276" w:lineRule="auto"/>
+              <w:jc w:val="center"/>
+              <w:rPr>
+                <w:rFonts w:ascii="Trebuchet MS" w:hAnsi="Trebuchet MS" w:cs="Arial"/>
+                <w:b/>
+                <w:bCs/>
+                <w:sz w:val="24"/>
+                <w:szCs w:val="24"/>
+                <w:lang w:eastAsia="tr-TR" w:bidi="tr-TR"/>
+              </w:rPr>
+            </w:pPr>
+            <w:r>
+              <w:rPr>
+                <w:rFonts w:ascii="Trebuchet MS" w:hAnsi="Trebuchet MS" w:cs="Arial"/>
+                <w:b/>
+                <w:bCs/>
+                <w:sz w:val="24"/>
+                <w:szCs w:val="24"/>
+                <w:lang w:eastAsia="tr-TR" w:bidi="tr-TR"/>
+              </w:rPr>
+              <w:t>Sabit Yataklama Elemanı</w:t>
+            </w:r>
+          </w:p>
+        </w:tc>
+        <w:tc>
+          <w:tcPr>
+            <w:tcW w:w="1166" w:type="dxa"/>
+          </w:tcPr>
+          <w:p>
+            <w:pPr>
+              <w:spacing w:line="276" w:lineRule="auto"/>
+              <w:ind w:firstLine="459"/>
+              <w:jc w:val="both"/>
+              <w:rPr>
+                <w:rFonts w:ascii="Trebuchet MS" w:hAnsi="Trebuchet MS" w:cs="Arial"/>
+                <w:b/>
+                <w:i/>
+                <w:sz w:val="24"/>
+                <w:szCs w:val="24"/>
+                <w:lang w:eastAsia="tr-TR" w:bidi="tr-TR"/>
+              </w:rPr>
+            </w:pPr>
+            <w:r>
+              <w:t>BİVATEK</w:t>
+            </w:r>
+          </w:p>
+        </w:tc>
+        <w:tc>
+          <w:tcPr>
+            <w:tcW w:w="1267" w:type="dxa"/>
+          </w:tcPr>
+          <w:p>
+            <w:pPr>
+              <w:spacing w:line="276" w:lineRule="auto"/>
+              <w:ind w:firstLine="459"/>
+              <w:jc w:val="both"/>
+              <w:rPr>
+                <w:rFonts w:ascii="Trebuchet MS" w:hAnsi="Trebuchet MS" w:cs="Arial"/>
+                <w:b/>
+                <w:i/>
+                <w:sz w:val="24"/>
+                <w:szCs w:val="24"/>
+                <w:lang w:eastAsia="tr-TR" w:bidi="tr-TR"/>
+              </w:rPr>
+            </w:pPr>
+            <w:r>
+              <w:t>BK12 / BF12</w:t>
+            </w:r>
+          </w:p>
+        </w:tc>
+        <w:tc>
+          <w:tcPr>
+            <w:tcW w:w="3632" w:type="dxa"/>
+          </w:tcPr>
+          <w:p>
+            <w:pPr>
+              <w:spacing w:line="276" w:lineRule="auto"/>
+              <w:ind w:firstLine="459"/>
+              <w:jc w:val="both"/>
+              <w:rPr>
+                <w:rFonts w:ascii="Trebuchet MS" w:hAnsi="Trebuchet MS" w:cs="Arial"/>
+                <w:b/>
+                <w:i/>
+                <w:sz w:val="24"/>
+                <w:szCs w:val="24"/>
+                <w:lang w:eastAsia="tr-TR" w:bidi="tr-TR"/>
+              </w:rPr>
+            </w:pPr>
+            <w:r>
+              <w:t>Vidalı milin alt ve üst noktalardan eksenel/radyal olarak yataklanması için rulman blokları.</w:t>
+            </w:r>
+          </w:p>
+        </w:tc>
+        <w:tc>
+          <w:tcPr>
+            <w:tcW w:w="967" w:type="dxa"/>
+          </w:tcPr>
+          <w:p>
+            <w:pPr>
+              <w:spacing w:line="276" w:lineRule="auto"/>
+              <w:ind w:firstLine="459"/>
+              <w:jc w:val="both"/>
+              <w:rPr>
+                <w:rFonts w:ascii="Trebuchet MS" w:hAnsi="Trebuchet MS" w:cs="Arial"/>
+                <w:b/>
+                <w:sz w:val="24"/>
+                <w:szCs w:val="24"/>
+                <w:lang w:eastAsia="tr-TR" w:bidi="tr-TR"/>
+              </w:rPr>
+            </w:pPr>
+            <w:r>
+              <w:t>1.450,00 TL</w:t>
+            </w:r>
+          </w:p>
+        </w:tc>
+      </w:tr>
+      <w:tr>
+        <w:trPr>
+          <w:trHeight w:val="148"/>
+        </w:trPr>
+        <w:tc>
+          <w:tcPr>
+            <w:tcW w:w="1990" w:type="dxa"/>
+            <w:vAlign w:val="center"/>
+          </w:tcPr>
+          <w:p>
+            <w:pPr>
+              <w:spacing w:line="276" w:lineRule="auto"/>
+              <w:jc w:val="center"/>
+              <w:rPr>
+                <w:rFonts w:ascii="Trebuchet MS" w:hAnsi="Trebuchet MS" w:cs="Arial"/>
+                <w:b/>
+                <w:bCs/>
+                <w:sz w:val="24"/>
+                <w:szCs w:val="24"/>
+                <w:lang w:eastAsia="tr-TR" w:bidi="tr-TR"/>
+              </w:rPr>
+            </w:pPr>
+            <w:r>
+              <w:rPr>
+                <w:rFonts w:ascii="Trebuchet MS" w:hAnsi="Trebuchet MS" w:cs="Arial"/>
+                <w:b/>
+                <w:bCs/>
+                <w:sz w:val="24"/>
+                <w:szCs w:val="24"/>
+                <w:lang w:eastAsia="tr-TR" w:bidi="tr-TR"/>
+              </w:rPr>
+              <w:t>Esnek Kaplin</w:t>
+            </w:r>
+          </w:p>
+        </w:tc>
+        <w:tc>
+          <w:tcPr>
+            <w:tcW w:w="1166" w:type="dxa"/>
+          </w:tcPr>
+          <w:p>
+            <w:pPr>
+              <w:spacing w:line="276" w:lineRule="auto"/>
+              <w:ind w:firstLine="459"/>
+              <w:jc w:val="both"/>
+              <w:rPr>
+                <w:rFonts w:ascii="Trebuchet MS" w:hAnsi="Trebuchet MS" w:cs="Arial"/>
+                <w:b/>
+                <w:i/>
+                <w:sz w:val="24"/>
+                <w:szCs w:val="24"/>
+                <w:lang w:eastAsia="tr-TR" w:bidi="tr-TR"/>
+              </w:rPr>
+            </w:pPr>
+            <w:r>
+              <w:t>Takım tasarımı</w:t>
+            </w:r>
+          </w:p>
+        </w:tc>
+        <w:tc>
+          <w:tcPr>
+            <w:tcW w:w="1267" w:type="dxa"/>
+          </w:tcPr>
+          <w:p>
+            <w:pPr>
+              <w:spacing w:line="276" w:lineRule="auto"/>
+              <w:ind w:firstLine="459"/>
+              <w:jc w:val="both"/>
+              <w:rPr>
+                <w:rFonts w:ascii="Trebuchet MS" w:hAnsi="Trebuchet MS" w:cs="Arial"/>
+                <w:b/>
+                <w:i/>
+                <w:sz w:val="24"/>
+                <w:szCs w:val="24"/>
+                <w:lang w:eastAsia="tr-TR" w:bidi="tr-TR"/>
+              </w:rPr>
+            </w:pPr>
+            <w:r>
+              <w:t>Alüminyum Yaylı Kaplin</w:t>
+            </w:r>
+          </w:p>
+        </w:tc>
+        <w:tc>
+          <w:tcPr>
+            <w:tcW w:w="3632" w:type="dxa"/>
+          </w:tcPr>
+          <w:p>
+            <w:pPr>
+              <w:spacing w:line="276" w:lineRule="auto"/>
+              <w:ind w:firstLine="459"/>
+              <w:jc w:val="both"/>
+              <w:rPr>
+                <w:rFonts w:ascii="Trebuchet MS" w:hAnsi="Trebuchet MS" w:cs="Arial"/>
+                <w:b/>
+                <w:i/>
+                <w:sz w:val="24"/>
+                <w:szCs w:val="24"/>
+                <w:lang w:eastAsia="tr-TR" w:bidi="tr-TR"/>
+              </w:rPr>
+            </w:pPr>
+            <w:r>
+              <w:t>Motor mili ile vidalı mil arasındaki olası eksenel kaçıklıkları sönümleyen bağlantı elemanı.</w:t>
+            </w:r>
+          </w:p>
+        </w:tc>
+        <w:tc>
+          <w:tcPr>
+            <w:tcW w:w="967" w:type="dxa"/>
+          </w:tcPr>
+          <w:p>
+            <w:pPr>
+              <w:spacing w:line="276" w:lineRule="auto"/>
+              <w:ind w:firstLine="459"/>
+              <w:jc w:val="both"/>
+              <w:rPr>
+                <w:rFonts w:ascii="Trebuchet MS" w:hAnsi="Trebuchet MS" w:cs="Arial"/>
+                <w:b/>
+                <w:sz w:val="24"/>
+                <w:szCs w:val="24"/>
+                <w:lang w:eastAsia="tr-TR" w:bidi="tr-TR"/>
+              </w:rPr>
+            </w:pPr>
+            <w:r>
+              <w:t>Envanter</w:t>
+            </w:r>
+          </w:p>
+        </w:tc>
+      </w:tr>
+      <w:tr>
+        <w:trPr>
+          <w:trHeight w:val="148"/>
+        </w:trPr>
+        <w:tc>
+          <w:tcPr>
+            <w:tcW w:w="1990" w:type="dxa"/>
+            <w:vAlign w:val="center"/>
+          </w:tcPr>
+          <w:p>
+            <w:pPr>
+              <w:spacing w:line="276" w:lineRule="auto"/>
+              <w:jc w:val="center"/>
+              <w:rPr>
+                <w:rFonts w:ascii="Trebuchet MS" w:hAnsi="Trebuchet MS" w:cs="Arial"/>
+                <w:b/>
+                <w:bCs/>
+                <w:sz w:val="24"/>
+                <w:szCs w:val="24"/>
+                <w:lang w:eastAsia="tr-TR" w:bidi="tr-TR"/>
+              </w:rPr>
+            </w:pPr>
+            <w:r>
+              <w:rPr>
+                <w:rFonts w:ascii="Trebuchet MS" w:hAnsi="Trebuchet MS" w:cs="Arial"/>
+                <w:b/>
+                <w:bCs/>
+                <w:sz w:val="24"/>
+                <w:szCs w:val="24"/>
+                <w:lang w:eastAsia="tr-TR" w:bidi="tr-TR"/>
+              </w:rPr>
+              <w:t>Robot Ana Şasisi</w:t>
+            </w:r>
+          </w:p>
+        </w:tc>
+        <w:tc>
+          <w:tcPr>
+            <w:tcW w:w="1166" w:type="dxa"/>
+          </w:tcPr>
+          <w:p>
+            <w:pPr>
+              <w:spacing w:line="276" w:lineRule="auto"/>
+              <w:ind w:firstLine="459"/>
+              <w:jc w:val="both"/>
+              <w:rPr>
+                <w:rFonts w:ascii="Trebuchet MS" w:hAnsi="Trebuchet MS" w:cs="Arial"/>
+                <w:b/>
+                <w:i/>
+                <w:sz w:val="24"/>
+                <w:szCs w:val="24"/>
+                <w:lang w:eastAsia="tr-TR" w:bidi="tr-TR"/>
+              </w:rPr>
+            </w:pPr>
+            <w:r>
+              <w:t>Takım tasarımı</w:t>
+            </w:r>
+          </w:p>
+        </w:tc>
+        <w:tc>
+          <w:tcPr>
+            <w:tcW w:w="1267" w:type="dxa"/>
+          </w:tcPr>
+          <w:p>
+            <w:pPr>
+              <w:spacing w:line="276" w:lineRule="auto"/>
+              <w:ind w:firstLine="459"/>
+              <w:jc w:val="both"/>
+              <w:rPr>
+                <w:rFonts w:ascii="Trebuchet MS" w:hAnsi="Trebuchet MS" w:cs="Arial"/>
+                <w:b/>
+                <w:i/>
+                <w:sz w:val="24"/>
+                <w:szCs w:val="24"/>
+                <w:lang w:eastAsia="tr-TR" w:bidi="tr-TR"/>
+              </w:rPr>
+            </w:pPr>
+            <w:r>
+              <w:t>AGV-S2026</w:t>
+            </w:r>
+          </w:p>
+        </w:tc>
+        <w:tc>
+          <w:tcPr>
+            <w:tcW w:w="3632" w:type="dxa"/>
+          </w:tcPr>
+          <w:p>
+            <w:pPr>
+              <w:spacing w:line="276" w:lineRule="auto"/>
+              <w:ind w:firstLine="459"/>
+              <w:jc w:val="both"/>
+              <w:rPr>
+                <w:rFonts w:ascii="Trebuchet MS" w:hAnsi="Trebuchet MS" w:cs="Arial"/>
+                <w:b/>
+                <w:i/>
+                <w:sz w:val="24"/>
+                <w:szCs w:val="24"/>
+                <w:lang w:eastAsia="tr-TR" w:bidi="tr-TR"/>
+              </w:rPr>
+            </w:pPr>
+            <w:r>
+              <w:t>Tüm mekanik, elektrik ve sensör donanımını üzerinde barındıran endüstriyel tip elektrostatik boyalı çelik şasi.</w:t>
+            </w:r>
+          </w:p>
+        </w:tc>
+        <w:tc>
+          <w:tcPr>
+            <w:tcW w:w="967" w:type="dxa"/>
+          </w:tcPr>
+          <w:p>
+            <w:pPr>
+              <w:spacing w:line="276" w:lineRule="auto"/>
+              <w:ind w:firstLine="459"/>
+              <w:jc w:val="both"/>
+              <w:rPr>
+                <w:rFonts w:ascii="Trebuchet MS" w:hAnsi="Trebuchet MS" w:cs="Arial"/>
+                <w:b/>
+                <w:sz w:val="24"/>
+                <w:szCs w:val="24"/>
+                <w:lang w:eastAsia="tr-TR" w:bidi="tr-TR"/>
+              </w:rPr>
+            </w:pPr>
+            <w:r>
+              <w:t>Envanter</w:t>
+            </w:r>
           </w:p>
         </w:tc>
       </w:tr>
@@ -6144,6 +6700,9 @@
                 <w:lang w:eastAsia="tr-TR" w:bidi="tr-TR"/>
               </w:rPr>
             </w:pPr>
+            <w:r>
+              <w:t>Takım tasarımı</w:t>
+            </w:r>
           </w:p>
         </w:tc>
         <w:tc>
@@ -6162,6 +6721,9 @@
                 <w:lang w:eastAsia="tr-TR" w:bidi="tr-TR"/>
               </w:rPr>
             </w:pPr>
+            <w:r>
+              <w:t>VOL-İ 38 / Özgün Tasarım v1</w:t>
+            </w:r>
           </w:p>
         </w:tc>
         <w:tc>
@@ -6180,6 +6742,9 @@
                 <w:lang w:eastAsia="tr-TR" w:bidi="tr-TR"/>
               </w:rPr>
             </w:pPr>
+            <w:r>
+              <w:t>Çelik profil şase ve forklift gövdesiyle yük taşıma ve transfer mekanizması. Lineer ray, bilyalı vida ve kızak blok yapısı; DC redüktörlü motor tahrikli 0-300 mm strok; alt-üst limit sensörleri ve ToF/ultrasonik çatal yükseklik sensörü planlanmaktadır.</w:t>
+            </w:r>
           </w:p>
         </w:tc>
         <w:tc>
@@ -6198,6 +6763,9 @@
                 <w:lang w:eastAsia="tr-TR" w:bidi="tr-TR"/>
               </w:rPr>
             </w:pPr>
+            <w:r>
+              <w:t>4500 TL / Envanter kontrol gerekli</w:t>
+            </w:r>
           </w:p>
         </w:tc>
       </w:tr>
@@ -8482,14 +9050,15 @@
               <w:spacing w:before="0" w:after="0"/>
               <w:jc w:val="center"/>
             </w:pPr>
-            <w:r/>
+            <w:r>
+              <w:t>Şerit Takip</w:t>
+            </w:r>
             <w:r>
               <w:rPr>
                 <w:rFonts w:ascii="Trebuchet MS" w:hAnsi="Trebuchet MS" w:eastAsia="Trebuchet MS"/>
                 <w:b w:val="0"/>
                 <w:sz w:val="16"/>
               </w:rPr>
-              <w:t>Şerit Takip</w:t>
             </w:r>
           </w:p>
         </w:tc>
@@ -8503,14 +9072,15 @@
               <w:spacing w:before="0" w:after="0"/>
               <w:jc w:val="center"/>
             </w:pPr>
-            <w:r/>
+            <w:r>
+              <w:t>VOL-İ</w:t>
+            </w:r>
             <w:r>
               <w:rPr>
                 <w:rFonts w:ascii="Trebuchet MS" w:hAnsi="Trebuchet MS" w:eastAsia="Trebuchet MS"/>
                 <w:b w:val="0"/>
                 <w:sz w:val="15"/>
               </w:rPr>
-              <w:t>VOL-İ</w:t>
             </w:r>
           </w:p>
         </w:tc>
@@ -8524,14 +9094,15 @@
               <w:spacing w:before="0" w:after="0"/>
               <w:jc w:val="center"/>
             </w:pPr>
-            <w:r/>
+            <w:r>
+              <w:t>OpenCV HSV</w:t>
+            </w:r>
             <w:r>
               <w:rPr>
                 <w:rFonts w:ascii="Trebuchet MS" w:hAnsi="Trebuchet MS" w:eastAsia="Trebuchet MS"/>
                 <w:b w:val="0"/>
                 <w:sz w:val="15"/>
               </w:rPr>
-              <w:t>Görüntü işleme</w:t>
             </w:r>
           </w:p>
         </w:tc>
@@ -8545,14 +9116,15 @@
               <w:spacing w:before="0" w:after="0"/>
               <w:jc w:val="left"/>
             </w:pPr>
-            <w:r/>
+            <w:r>
+              <w:t>Kamera ile hat ve renk takibi yapılarak robotun yön düzeltmesi sağlanacaktır.</w:t>
+            </w:r>
             <w:r>
               <w:rPr>
                 <w:rFonts w:ascii="Trebuchet MS" w:hAnsi="Trebuchet MS" w:eastAsia="Trebuchet MS"/>
                 <w:b w:val="0"/>
                 <w:sz w:val="15"/>
               </w:rPr>
-              <w:t>Kamera görüntüsünden renkli şerit algılanacak ve robotun yön düzeltmesi yapılacaktır.</w:t>
             </w:r>
           </w:p>
         </w:tc>
@@ -8566,14 +9138,15 @@
               <w:spacing w:before="0" w:after="0"/>
               <w:jc w:val="center"/>
             </w:pPr>
-            <w:r/>
+            <w:r>
+              <w:t>Envanter</w:t>
+            </w:r>
             <w:r>
               <w:rPr>
                 <w:rFonts w:ascii="Trebuchet MS" w:hAnsi="Trebuchet MS" w:eastAsia="Trebuchet MS"/>
                 <w:b w:val="0"/>
                 <w:sz w:val="15"/>
               </w:rPr>
-              <w:t>Envanter</w:t>
             </w:r>
           </w:p>
         </w:tc>
@@ -8592,14 +9165,15 @@
               <w:spacing w:before="0" w:after="0"/>
               <w:jc w:val="center"/>
             </w:pPr>
-            <w:r/>
+            <w:r>
+              <w:t>Yük Alma Taşıma Bırakma</w:t>
+            </w:r>
             <w:r>
               <w:rPr>
                 <w:rFonts w:ascii="Trebuchet MS" w:hAnsi="Trebuchet MS" w:eastAsia="Trebuchet MS"/>
                 <w:b w:val="0"/>
                 <w:sz w:val="16"/>
               </w:rPr>
-              <w:t>Yük Alma Taşıma Bırakma</w:t>
             </w:r>
           </w:p>
         </w:tc>
@@ -8613,14 +9187,15 @@
               <w:spacing w:before="0" w:after="0"/>
               <w:jc w:val="center"/>
             </w:pPr>
-            <w:r/>
+            <w:r>
+              <w:t>VOL-İ</w:t>
+            </w:r>
             <w:r>
               <w:rPr>
                 <w:rFonts w:ascii="Trebuchet MS" w:hAnsi="Trebuchet MS" w:eastAsia="Trebuchet MS"/>
                 <w:b w:val="0"/>
                 <w:sz w:val="15"/>
               </w:rPr>
-              <w:t>VOL-İ</w:t>
             </w:r>
           </w:p>
         </w:tc>
@@ -8634,14 +9209,15 @@
               <w:spacing w:before="0" w:after="0"/>
               <w:jc w:val="center"/>
             </w:pPr>
-            <w:r/>
+            <w:r>
+              <w:t>PID Kontrol / Koordinat Log</w:t>
+            </w:r>
             <w:r>
               <w:rPr>
                 <w:rFonts w:ascii="Trebuchet MS" w:hAnsi="Trebuchet MS" w:eastAsia="Trebuchet MS"/>
                 <w:b w:val="0"/>
                 <w:sz w:val="15"/>
               </w:rPr>
-              <w:t>Görev akışı</w:t>
             </w:r>
           </w:p>
         </w:tc>
@@ -8655,14 +9231,15 @@
               <w:spacing w:before="0" w:after="0"/>
               <w:jc w:val="left"/>
             </w:pPr>
-            <w:r/>
+            <w:r>
+              <w:t>Enkoder destekli hassas sürüşle yük taşıma yapılacak; belirlenen noktada koordinat bilgisine göre duruş ve bırakma adımı yönetilecektir.</w:t>
+            </w:r>
             <w:r>
               <w:rPr>
                 <w:rFonts w:ascii="Trebuchet MS" w:hAnsi="Trebuchet MS" w:eastAsia="Trebuchet MS"/>
                 <w:b w:val="0"/>
                 <w:sz w:val="15"/>
               </w:rPr>
-              <w:t>QR/konum bilgisiyle yaklaşma, çatal hizalama, taşıma ve bırakma adımları yönetilecektir.</w:t>
             </w:r>
           </w:p>
         </w:tc>
@@ -8676,14 +9253,15 @@
               <w:spacing w:before="0" w:after="0"/>
               <w:jc w:val="center"/>
             </w:pPr>
-            <w:r/>
+            <w:r>
+              <w:t>Envanter</w:t>
+            </w:r>
             <w:r>
               <w:rPr>
                 <w:rFonts w:ascii="Trebuchet MS" w:hAnsi="Trebuchet MS" w:eastAsia="Trebuchet MS"/>
                 <w:b w:val="0"/>
                 <w:sz w:val="15"/>
               </w:rPr>
-              <w:t>Envanter</w:t>
             </w:r>
           </w:p>
         </w:tc>
@@ -8702,14 +9280,15 @@
               <w:spacing w:before="0" w:after="0"/>
               <w:jc w:val="center"/>
             </w:pPr>
-            <w:r/>
+            <w:r>
+              <w:t>Haritalama</w:t>
+            </w:r>
             <w:r>
               <w:rPr>
                 <w:rFonts w:ascii="Trebuchet MS" w:hAnsi="Trebuchet MS" w:eastAsia="Trebuchet MS"/>
                 <w:b w:val="0"/>
                 <w:sz w:val="16"/>
               </w:rPr>
-              <w:t>Haritalama</w:t>
             </w:r>
           </w:p>
         </w:tc>
@@ -8723,14 +9302,15 @@
               <w:spacing w:before="0" w:after="0"/>
               <w:jc w:val="center"/>
             </w:pPr>
-            <w:r/>
+            <w:r>
+              <w:t>VOL-İ</w:t>
+            </w:r>
             <w:r>
               <w:rPr>
                 <w:rFonts w:ascii="Trebuchet MS" w:hAnsi="Trebuchet MS" w:eastAsia="Trebuchet MS"/>
                 <w:b w:val="0"/>
                 <w:sz w:val="15"/>
               </w:rPr>
-              <w:t>VOL-İ</w:t>
             </w:r>
           </w:p>
         </w:tc>
@@ -8744,14 +9324,15 @@
               <w:spacing w:before="0" w:after="0"/>
               <w:jc w:val="center"/>
             </w:pPr>
-            <w:r/>
+            <w:r>
+              <w:t>Gmapping / 2D LiDAR</w:t>
+            </w:r>
             <w:r>
               <w:rPr>
                 <w:rFonts w:ascii="Trebuchet MS" w:hAnsi="Trebuchet MS" w:eastAsia="Trebuchet MS"/>
                 <w:b w:val="0"/>
                 <w:sz w:val="15"/>
               </w:rPr>
-              <w:t>2D LiDAR tabanlı</w:t>
             </w:r>
           </w:p>
         </w:tc>
@@ -8765,14 +9346,15 @@
               <w:spacing w:before="0" w:after="0"/>
               <w:jc w:val="left"/>
             </w:pPr>
-            <w:r/>
+            <w:r>
+              <w:t>LiDAR verisi ile 2D harita çıkarılacak; rota ve görev noktaları harita üzerinde tanımlanacaktır.</w:t>
+            </w:r>
             <w:r>
               <w:rPr>
                 <w:rFonts w:ascii="Trebuchet MS" w:hAnsi="Trebuchet MS" w:eastAsia="Trebuchet MS"/>
                 <w:b w:val="0"/>
                 <w:sz w:val="15"/>
               </w:rPr>
-              <w:t>Yarışma alanı haritalanacak; rota ve görev noktaları harita üzerinde tanımlanacaktır.</w:t>
             </w:r>
           </w:p>
         </w:tc>
@@ -8786,14 +9368,15 @@
               <w:spacing w:before="0" w:after="0"/>
               <w:jc w:val="center"/>
             </w:pPr>
-            <w:r/>
+            <w:r>
+              <w:t>Envanter</w:t>
+            </w:r>
             <w:r>
               <w:rPr>
                 <w:rFonts w:ascii="Trebuchet MS" w:hAnsi="Trebuchet MS" w:eastAsia="Trebuchet MS"/>
                 <w:b w:val="0"/>
                 <w:sz w:val="15"/>
               </w:rPr>
-              <w:t>Envanter</w:t>
             </w:r>
           </w:p>
         </w:tc>
@@ -9042,14 +9625,15 @@
               <w:spacing w:before="0" w:after="0"/>
               <w:jc w:val="center"/>
             </w:pPr>
-            <w:r/>
+            <w:r>
+              <w:t>Otonom kontrol yazılımı</w:t>
+            </w:r>
             <w:r>
               <w:rPr>
                 <w:rFonts w:ascii="Trebuchet MS" w:hAnsi="Trebuchet MS" w:eastAsia="Trebuchet MS"/>
                 <w:b w:val="0"/>
                 <w:sz w:val="16"/>
               </w:rPr>
-              <w:t>Otonom kontrol yazılımı</w:t>
             </w:r>
           </w:p>
         </w:tc>
@@ -9063,14 +9647,15 @@
               <w:spacing w:before="0" w:after="0"/>
               <w:jc w:val="center"/>
             </w:pPr>
-            <w:r/>
+            <w:r>
+              <w:t>VOL-İ</w:t>
+            </w:r>
             <w:r>
               <w:rPr>
                 <w:rFonts w:ascii="Trebuchet MS" w:hAnsi="Trebuchet MS" w:eastAsia="Trebuchet MS"/>
                 <w:b w:val="0"/>
                 <w:sz w:val="15"/>
               </w:rPr>
-              <w:t>VOL-İ</w:t>
             </w:r>
           </w:p>
         </w:tc>
@@ -9084,14 +9669,15 @@
               <w:spacing w:before="0" w:after="0"/>
               <w:jc w:val="center"/>
             </w:pPr>
-            <w:r/>
+            <w:r>
+              <w:t>ROS Humble / Ubuntu 22.04</w:t>
+            </w:r>
             <w:r>
               <w:rPr>
                 <w:rFonts w:ascii="Trebuchet MS" w:hAnsi="Trebuchet MS" w:eastAsia="Trebuchet MS"/>
                 <w:b w:val="0"/>
                 <w:sz w:val="15"/>
               </w:rPr>
-              <w:t>ROS 2 / Python-C++</w:t>
             </w:r>
           </w:p>
         </w:tc>
@@ -9105,14 +9691,15 @@
               <w:spacing w:before="0" w:after="0"/>
               <w:jc w:val="left"/>
             </w:pPr>
-            <w:r/>
+            <w:r>
+              <w:t>Otonom robotik düğüm yönetimi, görev yönetimi, rota takibi ve sensör verilerinin işlenmesi için kullanılacaktır.</w:t>
+            </w:r>
             <w:r>
               <w:rPr>
                 <w:rFonts w:ascii="Trebuchet MS" w:hAnsi="Trebuchet MS" w:eastAsia="Trebuchet MS"/>
                 <w:b w:val="0"/>
                 <w:sz w:val="15"/>
               </w:rPr>
-              <w:t>Görev yönetimi, rota takibi ve sensör verilerinin işlenmesi için geliştirilecektir.</w:t>
             </w:r>
           </w:p>
         </w:tc>
@@ -9126,14 +9713,15 @@
               <w:spacing w:before="0" w:after="0"/>
               <w:jc w:val="center"/>
             </w:pPr>
-            <w:r/>
+            <w:r>
+              <w:t>Envanter</w:t>
+            </w:r>
             <w:r>
               <w:rPr>
                 <w:rFonts w:ascii="Trebuchet MS" w:hAnsi="Trebuchet MS" w:eastAsia="Trebuchet MS"/>
                 <w:b w:val="0"/>
                 <w:sz w:val="15"/>
               </w:rPr>
-              <w:t>Envanter</w:t>
             </w:r>
           </w:p>
         </w:tc>
@@ -9152,14 +9740,15 @@
               <w:spacing w:before="0" w:after="0"/>
               <w:jc w:val="center"/>
             </w:pPr>
-            <w:r/>
+            <w:r>
+              <w:t>Görüntü işleme yazılımı</w:t>
+            </w:r>
             <w:r>
               <w:rPr>
                 <w:rFonts w:ascii="Trebuchet MS" w:hAnsi="Trebuchet MS" w:eastAsia="Trebuchet MS"/>
                 <w:b w:val="0"/>
                 <w:sz w:val="16"/>
               </w:rPr>
-              <w:t>Görüntü işleme yazılımı</w:t>
             </w:r>
           </w:p>
         </w:tc>
@@ -9173,14 +9762,15 @@
               <w:spacing w:before="0" w:after="0"/>
               <w:jc w:val="center"/>
             </w:pPr>
-            <w:r/>
+            <w:r>
+              <w:t>OpenCV</w:t>
+            </w:r>
             <w:r>
               <w:rPr>
                 <w:rFonts w:ascii="Trebuchet MS" w:hAnsi="Trebuchet MS" w:eastAsia="Trebuchet MS"/>
                 <w:b w:val="0"/>
                 <w:sz w:val="15"/>
               </w:rPr>
-              <w:t>VOL-İ</w:t>
             </w:r>
           </w:p>
         </w:tc>
@@ -9194,14 +9784,15 @@
               <w:spacing w:before="0" w:after="0"/>
               <w:jc w:val="center"/>
             </w:pPr>
-            <w:r/>
+            <w:r>
+              <w:t>OpenCV v4.x</w:t>
+            </w:r>
             <w:r>
               <w:rPr>
                 <w:rFonts w:ascii="Trebuchet MS" w:hAnsi="Trebuchet MS" w:eastAsia="Trebuchet MS"/>
                 <w:b w:val="0"/>
                 <w:sz w:val="15"/>
               </w:rPr>
-              <w:t>OpenCV tabanlı</w:t>
             </w:r>
           </w:p>
         </w:tc>
@@ -9215,14 +9806,15 @@
               <w:spacing w:before="0" w:after="0"/>
               <w:jc w:val="left"/>
             </w:pPr>
-            <w:r/>
+            <w:r>
+              <w:t>QR kod okuma, renkli şerit algılama, nesne/palet tespiti ve hizalama işlemlerinde kullanılacaktır.</w:t>
+            </w:r>
             <w:r>
               <w:rPr>
                 <w:rFonts w:ascii="Trebuchet MS" w:hAnsi="Trebuchet MS" w:eastAsia="Trebuchet MS"/>
                 <w:b w:val="0"/>
                 <w:sz w:val="15"/>
               </w:rPr>
-              <w:t>QR kod okuma ve renkli şerit algılama işlemlerinde kullanılacaktır.</w:t>
             </w:r>
           </w:p>
         </w:tc>
@@ -9236,14 +9828,15 @@
               <w:spacing w:before="0" w:after="0"/>
               <w:jc w:val="center"/>
             </w:pPr>
-            <w:r/>
+            <w:r>
+              <w:t>Envanter</w:t>
+            </w:r>
             <w:r>
               <w:rPr>
                 <w:rFonts w:ascii="Trebuchet MS" w:hAnsi="Trebuchet MS" w:eastAsia="Trebuchet MS"/>
                 <w:b w:val="0"/>
                 <w:sz w:val="15"/>
               </w:rPr>
-              <w:t>Envanter</w:t>
             </w:r>
           </w:p>
         </w:tc>
@@ -9262,14 +9855,15 @@
               <w:spacing w:before="0" w:after="0"/>
               <w:jc w:val="center"/>
             </w:pPr>
-            <w:r/>
+            <w:r>
+              <w:t>Kullanıcı arayüzü</w:t>
+            </w:r>
             <w:r>
               <w:rPr>
                 <w:rFonts w:ascii="Trebuchet MS" w:hAnsi="Trebuchet MS" w:eastAsia="Trebuchet MS"/>
                 <w:b w:val="0"/>
                 <w:sz w:val="16"/>
               </w:rPr>
-              <w:t>Kullanıcı arayüzü</w:t>
             </w:r>
           </w:p>
         </w:tc>
@@ -9283,14 +9877,15 @@
               <w:spacing w:before="0" w:after="0"/>
               <w:jc w:val="center"/>
             </w:pPr>
-            <w:r/>
+            <w:r>
+              <w:t>VOL-İ</w:t>
+            </w:r>
             <w:r>
               <w:rPr>
                 <w:rFonts w:ascii="Trebuchet MS" w:hAnsi="Trebuchet MS" w:eastAsia="Trebuchet MS"/>
                 <w:b w:val="0"/>
                 <w:sz w:val="15"/>
               </w:rPr>
-              <w:t>VOL-İ</w:t>
             </w:r>
           </w:p>
         </w:tc>
@@ -9304,14 +9899,15 @@
               <w:spacing w:before="0" w:after="0"/>
               <w:jc w:val="center"/>
             </w:pPr>
-            <w:r/>
+            <w:r>
+              <w:t>Web/Python GUI</w:t>
+            </w:r>
             <w:r>
               <w:rPr>
                 <w:rFonts w:ascii="Trebuchet MS" w:hAnsi="Trebuchet MS" w:eastAsia="Trebuchet MS"/>
                 <w:b w:val="0"/>
                 <w:sz w:val="15"/>
               </w:rPr>
-              <w:t>Web/Python GUI</w:t>
             </w:r>
           </w:p>
         </w:tc>
@@ -9325,14 +9921,15 @@
               <w:spacing w:before="0" w:after="0"/>
               <w:jc w:val="left"/>
             </w:pPr>
-            <w:r/>
+            <w:r>
+              <w:t>Robot durumu, görev bilgisi, QR bilgisi, haberleşme ve hata durumları izlenecektir.</w:t>
+            </w:r>
             <w:r>
               <w:rPr>
                 <w:rFonts w:ascii="Trebuchet MS" w:hAnsi="Trebuchet MS" w:eastAsia="Trebuchet MS"/>
                 <w:b w:val="0"/>
                 <w:sz w:val="15"/>
               </w:rPr>
-              <w:t>Robot durumu, görev bilgisi, QR bilgisi, haberleşme ve hata durumları izlenecektir.</w:t>
             </w:r>
           </w:p>
         </w:tc>
@@ -9346,14 +9943,15 @@
               <w:spacing w:before="0" w:after="0"/>
               <w:jc w:val="center"/>
             </w:pPr>
-            <w:r/>
+            <w:r>
+              <w:t>Envanter</w:t>
+            </w:r>
             <w:r>
               <w:rPr>
                 <w:rFonts w:ascii="Trebuchet MS" w:hAnsi="Trebuchet MS" w:eastAsia="Trebuchet MS"/>
                 <w:b w:val="0"/>
                 <w:sz w:val="15"/>
               </w:rPr>
-              <w:t>Envanter</w:t>
             </w:r>
           </w:p>
         </w:tc>
@@ -9372,14 +9970,15 @@
               <w:spacing w:before="0" w:after="0"/>
               <w:jc w:val="center"/>
             </w:pPr>
-            <w:r/>
+            <w:r>
+              <w:t>Haberleşme ve düşük seviye kontrol yazılımı</w:t>
+            </w:r>
             <w:r>
               <w:rPr>
                 <w:rFonts w:ascii="Trebuchet MS" w:hAnsi="Trebuchet MS" w:eastAsia="Trebuchet MS"/>
                 <w:b w:val="0"/>
                 <w:sz w:val="16"/>
               </w:rPr>
-              <w:t>Haberleşme yazılımı</w:t>
             </w:r>
           </w:p>
         </w:tc>
@@ -9393,14 +9992,15 @@
               <w:spacing w:before="0" w:after="0"/>
               <w:jc w:val="center"/>
             </w:pPr>
-            <w:r/>
+            <w:r>
+              <w:t>VOL-İ</w:t>
+            </w:r>
             <w:r>
               <w:rPr>
                 <w:rFonts w:ascii="Trebuchet MS" w:hAnsi="Trebuchet MS" w:eastAsia="Trebuchet MS"/>
                 <w:b w:val="0"/>
                 <w:sz w:val="15"/>
               </w:rPr>
-              <w:t>VOL-İ</w:t>
             </w:r>
           </w:p>
         </w:tc>
@@ -9414,14 +10014,15 @@
               <w:spacing w:before="0" w:after="0"/>
               <w:jc w:val="center"/>
             </w:pPr>
-            <w:r/>
+            <w:r>
+              <w:t>C++ / PID / Protokole uyumlu modül</w:t>
+            </w:r>
             <w:r>
               <w:rPr>
                 <w:rFonts w:ascii="Trebuchet MS" w:hAnsi="Trebuchet MS" w:eastAsia="Trebuchet MS"/>
                 <w:b w:val="0"/>
                 <w:sz w:val="15"/>
               </w:rPr>
-              <w:t>Protokole uyumlu modül</w:t>
             </w:r>
           </w:p>
         </w:tc>
@@ -9435,14 +10036,15 @@
               <w:spacing w:before="0" w:after="0"/>
               <w:jc w:val="left"/>
             </w:pPr>
-            <w:r/>
+            <w:r>
+              <w:t>Motor sürücü ve sensör kontrolü ile fabrika otomasyon sistemiyle görev alma, kapı izni ve görev tamamlama mesajları yönetilecektir.</w:t>
+            </w:r>
             <w:r>
               <w:rPr>
                 <w:rFonts w:ascii="Trebuchet MS" w:hAnsi="Trebuchet MS" w:eastAsia="Trebuchet MS"/>
                 <w:b w:val="0"/>
                 <w:sz w:val="15"/>
               </w:rPr>
-              <w:t>Fabrika otomasyon sistemiyle görev alma, kapı izni ve görev tamamlama mesajları için geliştirilecektir.</w:t>
             </w:r>
           </w:p>
         </w:tc>
@@ -9456,14 +10058,15 @@
               <w:spacing w:before="0" w:after="0"/>
               <w:jc w:val="center"/>
             </w:pPr>
-            <w:r/>
+            <w:r>
+              <w:t>Envanter</w:t>
+            </w:r>
             <w:r>
               <w:rPr>
                 <w:rFonts w:ascii="Trebuchet MS" w:hAnsi="Trebuchet MS" w:eastAsia="Trebuchet MS"/>
                 <w:b w:val="0"/>
                 <w:sz w:val="15"/>
               </w:rPr>
-              <w:t>Envanter</w:t>
             </w:r>
           </w:p>
         </w:tc>

</xml_diff>